<commit_message>
Expand methods preprocessing details
</commit_message>
<xml_diff>
--- a/paper/methods_standalone.docx
+++ b/paper/methods_standalone.docx
@@ -260,6 +260,14 @@
         <w:pStyle w:val="BodyText"/>
       </w:pPr>
       <w:r>
+        <w:t xml:space="preserve">The slice experiments were technically more challenging than the rat respiratory preparations used in many earlier studies. In particular, mouse XII rootlets were often delicate, and the recorded inspiratory output was not always the large, stereotyped population burst routinely observed in rat slices. Depending on how many fibers were captured by the suction electrode, the integrated XII trace could reflect only a partial motor output and could be less stationary across the file. We therefore treated the XII recording primarily as a cycle-timing reference and used additional preprocessing safeguards when the rootlet signal alone was too weak or unstable for reliable phase detection.</w:t>
+      </w:r>
+    </w:p>
+    <w:p>
+      <w:pPr>
+        <w:pStyle w:val="BodyText"/>
+      </w:pPr>
+      <w:r>
         <w:t xml:space="preserve">Optical targeting was performed with a Leica TCS SP5 II MP upright microscope equipped with a 20</w:t>
       </w:r>
       <m:oMath>
@@ -320,7 +328,7 @@
         <w:pStyle w:val="FirstParagraph"/>
       </w:pPr>
       <w:r>
-        <w:t xml:space="preserve">The repository contains 59 analyzed slice recordings spanning four phenotype groups: VgluT2 inspiratory (VgluT2-I), VgluT2 expiratory (VgluT2-E), VGAT inspiratory (VGAT-I), and VGAT expiratory (VGAT-E). Recordings were acquired in both current clamp (C) and voltage clamp (V), although not every cell was represented in both modes. Raw electrophysiological and XII signals were originally digitized at 10 kHz and then downsampled to 1 kHz for the exported analysis files used in this repository. This downsampling preserved the slower respiratory-cycle modulation, the stepwise command epochs, and the phase-binned current–voltage relationships used for conductance inference; reconstruction of the detailed spike waveform was not required for the analysis. Each exported trace contained four aligned columns: time, current channel, voltage channel, and integrated XII activity. In current clamp, the current and voltage channels corresponded to injected current and membrane potential, respectively; in voltage clamp, they corresponded to measured holding current and command voltage.</w:t>
+        <w:t xml:space="preserve">The repository contains 59 analyzed slice recordings spanning four phenotype groups: VgluT2 inspiratory (VgluT2-I), VgluT2 expiratory (VgluT2-E), VGAT inspiratory (VGAT-I), and VGAT expiratory (VGAT-E). These files are recording-level analysis units rather than unique-cell counts, because some neurons contributed separate current-clamp (C) and voltage-clamp (V) recordings. Raw electrophysiological and XII signals were originally digitized at 10 kHz and then downsampled to 1 kHz for the exported analysis files used in this repository. This downsampling preserved the slower respiratory-cycle modulation, the stepwise command epochs, and the phase-binned current–voltage relationships used for conductance inference; reconstruction of the detailed spike waveform was not required for the analysis. Each exported trace contained four aligned columns: time, current channel, voltage channel, and integrated XII activity. In current clamp, the current and voltage channels corresponded to injected current and membrane potential, respectively; in voltage clamp, they corresponded to measured holding current and command voltage.</w:t>
       </w:r>
     </w:p>
     <w:p>
@@ -353,7 +361,7 @@
         <w:t xml:space="preserve">Molkov et al. (2025)</w:t>
       </w:r>
       <w:r>
-        <w:t xml:space="preserve">, we did not impose strict requirements on the number of current or voltage steps per file or on the total command span covered by a given recording. Instead, we used an inclusive recording-level screen and then applied robust outlier filtering only after conductance reconstruction. The only hard acceptance criterion for inclusion in the population summaries was that the analyzed segment contain more than 25 detected XII cycles. This yielded 50 accepted recordings (27 current clamp, 23 voltage clamp): 20 VgluT2-I, 12 VGAT-I, 17 VGAT-E, and 1 VgluT2-E recording (Table </w:t>
+        <w:t xml:space="preserve">, we did not impose rigid file-level requirements such as at least three usable command steps or a prescribed current/voltage span. In this data set, criteria of that type would have discarded approximately two-thirds of the available slice recordings before any conductance-based quality control, largely for technical rather than biological reasons. Instead, we used an inclusive recording-level screen and then applied robust outlier filtering only after conductance reconstruction. The only hard acceptance criterion for inclusion in the population summaries was that the analyzed segment contain more than 25 detected XII cycles across the retained interval. This yielded 50 accepted recordings (27 current clamp, 23 voltage clamp): 20 VgluT2-I, 12 VGAT-I, 17 VGAT-E, and 1 VgluT2-E recording (Table </w:t>
       </w:r>
       <w:hyperlink w:anchor="tab:inventory">
         <w:r>
@@ -364,7 +372,21 @@
         </w:r>
       </w:hyperlink>
       <w:r>
-        <w:t xml:space="preserve">).</w:t>
+        <w:t xml:space="preserve">). The accepted recording set corresponds to 31 neuron-level identifiers, so the</w:t>
+      </w:r>
+      <w:r>
+        <w:t xml:space="preserve"> </w:t>
+      </w:r>
+      <m:oMath>
+        <m:r>
+          <m:t>N</m:t>
+        </m:r>
+      </m:oMath>
+      <w:r>
+        <w:t xml:space="preserve"> </w:t>
+      </w:r>
+      <w:r>
+        <w:t xml:space="preserve">values used in summary plots and tables refer to recordings, not unique cells. We retained current-clamp and voltage-clamp files as separate analysis units because mode-to-mode variability was comparable to cell-to-cell variability, while the two modes yielded qualitatively consistent conductance estimates.</w:t>
       </w:r>
     </w:p>
     <w:bookmarkStart w:id="10" w:name="tab:inventory"/>
@@ -373,7 +395,7 @@
         <w:pStyle w:val="TableCaption"/>
       </w:pPr>
       <w:r>
-        <w:t xml:space="preserve">Table 1. Recording inventory in the repository and after automated cycle-count screening.</w:t>
+        <w:t xml:space="preserve">Table 1. Recording inventory in the repository and after automated cycle-count screening. Counts refer to recordings, not unique neurons.</w:t>
       </w:r>
     </w:p>
     <w:tbl>
@@ -381,7 +403,7 @@
         <w:tblStyle w:val="Table"/>
         <w:tblW w:type="auto" w:w="0"/>
         <w:tblLook w:firstRow="1" w:lastRow="0" w:firstColumn="0" w:lastColumn="0" w:noHBand="0" w:noVBand="0" w:val="0020"/>
-        <w:tblCaption w:val="Table 1. Recording inventory in the repository and after automated cycle-count screening."/>
+        <w:tblCaption w:val="Table 1. Recording inventory in the repository and after automated cycle-count screening. Counts refer to recordings, not unique neurons."/>
       </w:tblPr>
       <w:tblGrid>
         <w:gridCol w:w="1584"/>
@@ -783,7 +805,7 @@
         </w:r>
       </w:hyperlink>
       <w:r>
-        <w:t xml:space="preserve">). A representative current-clamp/voltage-clamp pair from the same VgluT2-I neuron is shown to make the stepped acquisition strategy explicit, because this feature is not obvious from the conductance-reconstruction figure alone.</w:t>
+        <w:t xml:space="preserve">). A representative current-clamp/voltage-clamp pair from the same VgluT2-I neuron is shown to make the stepped acquisition strategy explicit, because this feature is not obvious from the conductance-reconstruction figure alone. Across the retained stationary interval, the multiple command levels were not analyzed one step at a time; instead, samples from all usable steps were pooled within each respiratory phase bin so that the full recording collectively supplied the current–voltage spread needed for phase-specific regression.</w:t>
       </w:r>
     </w:p>
     <w:bookmarkStart w:id="14" w:name="fig:protocol"/>
@@ -917,7 +939,19 @@
         <w:pStyle w:val="FirstParagraph"/>
       </w:pPr>
       <w:r>
-        <w:t xml:space="preserve">Several recordings required limited manual curation before automated inference. Specifically, some files were trimmed at the beginning or end to isolate the longest reasonably stationary interval and to exclude obvious initial transients or late drifts. In the current repository version, 6 accepted recordings used a non-zero starting offset and 6 used an explicit end truncation. These edits were intentionally conservative and were applied before any conductance estimates were calculated.</w:t>
+        <w:t xml:space="preserve">Several recordings required limited manual curation before automated inference. The purpose of this step was to isolate the longest interval that was reasonably stationary in both the electrophysiological channels and the respiratory reference, rather than to select epochs with any particular conductance pattern. Files were therefore trimmed at the beginning when the recording was still stabilizing, at the end when rhythmicity or seal quality deteriorated, and, when instability was present at both ends, to the middle portion that remained acceptably stationary. Thus</w:t>
+      </w:r>
+      <w:r>
+        <w:t xml:space="preserve"> </w:t>
+      </w:r>
+      <w:r>
+        <w:t xml:space="preserve">“middle selection”</w:t>
+      </w:r>
+      <w:r>
+        <w:t xml:space="preserve"> </w:t>
+      </w:r>
+      <w:r>
+        <w:t xml:space="preserve">was implemented by defining start and end boundaries around a single contiguous interval rather than by stitching together disjoint fragments. In the current repository version, 6 accepted recordings used a non-zero starting offset and 6 used an explicit end truncation. These edits were intentionally conservative and were applied before any conductance estimates were calculated.</w:t>
       </w:r>
     </w:p>
     <w:p>
@@ -925,7 +959,7 @@
         <w:pStyle w:val="BodyText"/>
       </w:pPr>
       <w:r>
-        <w:t xml:space="preserve">All signal processing was then automated. The current and voltage channels were median-filtered with a per-file half-width defined in the analysis configuration (default 25 samples, corresponding to a 51-sample window). The XII reference signal was optionally combined with the electrophysiological channel when the rootlet signal alone was too weak or unstable to give reliable cycle onsets. In those cases, the reference channel was converted to a local z-score and linearly combined with a local z-score of the membrane-potential channel (current clamp) or the current channel (voltage clamp):</w:t>
+        <w:t xml:space="preserve">All signal processing was then automated. The current and voltage channels were median-filtered with a per-file half-width defined in the analysis configuration (default 25 samples, corresponding to a 51-sample window). Because the mouse XII rootlet signal was not always sufficiently robust on its own, the reference channel was optionally combined with the simultaneously recorded electrophysiological channel when the rootlet trace was too weak, noisy, or unstable to give reliable cycle onsets. In those cases, the reference channel was converted to a local z-score and linearly combined with a local z-score of the membrane-potential channel (current clamp) or the current channel (voltage clamp):</w:t>
       </w:r>
     </w:p>
     <w:p>
@@ -1166,7 +1200,7 @@
         <w:t xml:space="preserve"> </w:t>
       </w:r>
       <w:r>
-        <w:t xml:space="preserve">was chosen empirically to align the sign of the auxiliary signal with inspiratory onset. Local means and standard deviations were computed in a sliding window (typically 2000 samples). Among the 50 accepted recordings, 6 used this mixed trigger signal and 12 used a broader median post-filter on the final reference trace than the default setting.</w:t>
+        <w:t xml:space="preserve">was chosen empirically to align the sign of the auxiliary signal with inspiratory onset. Local means and standard deviations were computed in a sliding window (typically 2000 samples). This mixed signal was used only for cycle detection and phase assignment; conductance inference itself still used the original current and voltage channels. Among the 50 accepted recordings, 6 used this mixed trigger signal and 12 used a broader median post-filter on the final reference trace than the default setting.</w:t>
       </w:r>
     </w:p>
     <w:bookmarkEnd w:id="16"/>
@@ -4992,7 +5026,7 @@
         <w:pStyle w:val="BodyText"/>
       </w:pPr>
       <w:r>
-        <w:t xml:space="preserve">For each group and each scalar metric, quartiles were computed across recordings, the interquartile range was defined as</w:t>
+        <w:t xml:space="preserve">Outliers were handled by a standard robust two-stage procedure: calculate a provisional distribution from all accepted recordings, identify extreme points using quantile-based criteria, remove those points from the summary statistics, and then recalculate the reported mean and SEM from the retained inliers. In practice, for each group and each scalar metric, quartiles were computed across recordings, the interquartile range was defined as</w:t>
       </w:r>
       <w:r>
         <w:t xml:space="preserve"> </w:t>
@@ -5177,7 +5211,7 @@
         <w:pStyle w:val="FirstParagraph"/>
       </w:pPr>
       <w:r>
-        <w:t xml:space="preserve">were labeled as outliers. Mean and SEM were then recomputed from the retained inliers only. Outliers were still displayed in the summary figure as separate markers but were not included in the reported group means or SEM values. This two-stage strategy was adopted because the slice data set contains recordings with limited command span or weaker reference signals that would be lost under rigid step-count criteria even though their reconstructed conductances fall well within the physiological distribution of the corresponding population.</w:t>
+        <w:t xml:space="preserve">were labeled as outliers. Mean and SEM were then recomputed from the retained inliers only. Outliers were still displayed in the summary figure as separate markers but were not included in the reported group means or SEM values. This is a standard accepted way to summarize small, heterogeneous experimental data sets while limiting the influence of rare extreme values. We adopted this two-stage strategy because the slice data set contains recordings with limited command span or weaker reference signals that would be lost under rigid step-count criteria even though their reconstructed conductances fall well within the physiological distribution of the corresponding population.</w:t>
       </w:r>
     </w:p>
     <w:bookmarkEnd w:id="26"/>

</xml_diff>